<commit_message>
docs: regenerate K Hotels evolution docx after G3 cross-reference
</commit_message>
<xml_diff>
--- a/docs/TODO-KHOTELS-EVOLUTION.docx
+++ b/docs/TODO-KHOTELS-EVOLUTION.docx
@@ -30,7 +30,7 @@
         <w:t>Framing rule: evolve, do not rewrite.</w:t>
       </w:r>
       <w:r>
-        <w:t xml:space="preserve"> No reversal of ADR-001, no runtime agent loop, &gt; no new tool protocol, no import of `app/agents/` into `app/runtime/`. Every item below is &gt; additive and sits on an existing seam. &gt; &gt; Companions: `TODO-DEMO-READINESS.md` (embeddings, agent API, frontend slices) and &gt; `TODO-INTEGRATION.md` (the L0–L6 build plan — see §4 for what this document removes).</w:t>
+        <w:t xml:space="preserve"> No reversal of ADR-001, no runtime agent loop, &gt; no new tool protocol, no import of `app/agents/` into `app/runtime/`. Every item below is &gt; additive and sits on an existing seam. &gt; &gt; Companions: `TODO-DEMO-READINESS.md` (embeddings, agent API, frontend slices), &gt; `TODO-INTEGRATION.md` (the L0–L6 build plan — see §4 for what this document removes), &gt; and `standards-alignment.md` (position against OWASP LLM/Agentic Top 10 and NIST; gap G3 &gt; there — knowledge ingestion integrity — applies directly to this work).</w:t>
       </w:r>
     </w:p>
     <w:p>
@@ -1682,12 +1682,27 @@
     </w:p>
     <w:p>
       <w:r>
-        <w:t>### K7 — Runtime evals · ~1 day</w:t>
+        <w:t xml:space="preserve">### K7 — Runtime evals · ~1 day · 🔴 </w:t>
+      </w:r>
+      <w:r>
+        <w:rPr>
+          <w:b/>
+        </w:rPr>
+        <w:t>raised to G1 by the standards assessment</w:t>
       </w:r>
     </w:p>
     <w:p>
       <w:r>
-        <w:t xml:space="preserve">Closes gap #5 from the architecture assessment: `app/evals/` covers </w:t>
+        <w:t xml:space="preserve">Closes the only 🔴 </w:t>
+      </w:r>
+      <w:r>
+        <w:rPr>
+          <w:b/>
+        </w:rPr>
+        <w:t>assurance</w:t>
+      </w:r>
+      <w:r>
+        <w:t xml:space="preserve"> gap in `standards-alignment.md`. `app/evals/` covers </w:t>
       </w:r>
       <w:r>
         <w:rPr>
@@ -1696,7 +1711,32 @@
         <w:t>only</w:t>
       </w:r>
       <w:r>
-        <w:t xml:space="preserve"> `website_analyst` today. Add a case type for the runtime assistant — grounding and citation accuracy, refusal when retrieval is weak, and adherence to per-tenant `system_instructions`.</w:t>
+        <w:t xml:space="preserve"> `website_analyst` today, and the 9 existing cases are </w:t>
+      </w:r>
+      <w:r>
+        <w:rPr>
+          <w:b/>
+        </w:rPr>
+        <w:t>not referenced in `.github/workflows/ci.yml`</w:t>
+      </w:r>
+      <w:r>
+        <w:t xml:space="preserve"> — so they are not a gate.</w:t>
+      </w:r>
+    </w:p>
+    <w:p>
+      <w:r>
+        <w:t>NIST's March 2026 automated-benchmark work is expected to define how agent assurance is measured. K3–K7 are all guest-facing behaviour with no regression detection behind them.</w:t>
+      </w:r>
+    </w:p>
+    <w:p>
+      <w:r>
+        <w:t xml:space="preserve">Add a runtime case type: grounding and citation accuracy, refusal when retrieval is weak, and adherence to per-tenant `system_instructions`. </w:t>
+      </w:r>
+      <w:r>
+        <w:rPr>
+          <w:b/>
+        </w:rPr>
+        <w:t>Wire evals into CI as a gate.</w:t>
       </w:r>
     </w:p>
     <w:p>
@@ -2279,6 +2319,25 @@
         <w:pStyle w:val="ListBullet"/>
       </w:pPr>
       <w:r>
+        <w:rPr>
+          <w:b/>
+        </w:rPr>
+        <w:t>Knowledge ingestion integrity</w:t>
+      </w:r>
+      <w:r>
+        <w:t xml:space="preserve"> (`standards-alignment.md` G3): nothing verifies document</w:t>
+      </w:r>
+    </w:p>
+    <w:p>
+      <w:r>
+        <w:t>provenance. This got *worse* when Item 1 landed — under hash embeddings a poisoned document was only retrievable by keyword match; under real semantic embeddings it is retrievable by *meaning*. Every guest answer for K Hotels comes from that corpus. Worth deciding whether a document should require tenant confirmation before it becomes `READY`.</w:t>
+      </w:r>
+    </w:p>
+    <w:p>
+      <w:pPr>
+        <w:pStyle w:val="ListBullet"/>
+      </w:pPr>
+      <w:r>
         <w:t>Multi-tenant test coverage: K3–K5 all touch tenancy. Confirm the isolation tests cover the</w:t>
       </w:r>
     </w:p>

</xml_diff>